<commit_message>
ajout plan de projet pour validation
</commit_message>
<xml_diff>
--- a/Section5-Normes_v0.3.docx
+++ b/Section5-Normes_v0.3.docx
@@ -1223,17 +1223,7 @@
           <w:sz w:val="21"/>
           <w:szCs w:val="21"/>
         </w:rPr>
-        <w:t>5.3.1 Déclaration</w:t>
-      </w:r>
-      <w:r>
-        <w:rPr>
-          <w:b/>
-          <w:bCs/>
-          <w:color w:val="1A1A19"/>
-          <w:sz w:val="21"/>
-          <w:szCs w:val="21"/>
-        </w:rPr>
-        <w:t xml:space="preserve"> d’applicabilité</w:t>
+        <w:t>5.3.1 Déclaration d’applicabilité</w:t>
       </w:r>
     </w:p>
     <w:p>
@@ -1354,7 +1344,25 @@
                 <w:sz w:val="16"/>
                 <w:szCs w:val="16"/>
               </w:rPr>
-              <w:t xml:space="preserve">Normes consultées — principes retenus, conformité non </w:t>
+              <w:t xml:space="preserve">Normes consultées </w:t>
+            </w:r>
+            <w:r>
+              <w:rPr>
+                <w:b/>
+                <w:bCs/>
+                <w:sz w:val="16"/>
+                <w:szCs w:val="16"/>
+              </w:rPr>
+              <w:t>-</w:t>
+            </w:r>
+            <w:r>
+              <w:rPr>
+                <w:b/>
+                <w:bCs/>
+                <w:sz w:val="16"/>
+                <w:szCs w:val="16"/>
+              </w:rPr>
+              <w:t xml:space="preserve"> principes retenus, conformité non </w:t>
             </w:r>
             <w:r>
               <w:rPr>
@@ -2275,7 +2283,23 @@
                 <w:sz w:val="15"/>
                 <w:szCs w:val="15"/>
               </w:rPr>
-              <w:t>Qualité des systèmes et du logiciel (SQuaRE)</w:t>
+              <w:t>Qualité des systèmes et du logiciel (</w:t>
+            </w:r>
+            <w:proofErr w:type="spellStart"/>
+            <w:r>
+              <w:rPr>
+                <w:sz w:val="15"/>
+                <w:szCs w:val="15"/>
+              </w:rPr>
+              <w:t>SQuaRE</w:t>
+            </w:r>
+            <w:proofErr w:type="spellEnd"/>
+            <w:r>
+              <w:rPr>
+                <w:sz w:val="15"/>
+                <w:szCs w:val="15"/>
+              </w:rPr>
+              <w:t>)</w:t>
             </w:r>
           </w:p>
         </w:tc>
@@ -4970,7 +4994,23 @@
           <w:sz w:val="18"/>
           <w:szCs w:val="18"/>
         </w:rPr>
-        <w:t xml:space="preserve">/IEC 25010:2023, Ingénierie des systèmes et du logiciel — Exigences de qualité et évaluation (SQuaRE) — Modèle de qualité du produit. </w:t>
+        <w:t>/IEC 25010:2023, Ingénierie des systèmes et du logiciel — Exigences de qualité et évaluation (</w:t>
+      </w:r>
+      <w:proofErr w:type="spellStart"/>
+      <w:r>
+        <w:rPr>
+          <w:sz w:val="18"/>
+          <w:szCs w:val="18"/>
+        </w:rPr>
+        <w:t>SQuaRE</w:t>
+      </w:r>
+      <w:proofErr w:type="spellEnd"/>
+      <w:r>
+        <w:rPr>
+          <w:sz w:val="18"/>
+          <w:szCs w:val="18"/>
+        </w:rPr>
+        <w:t xml:space="preserve">) — Modèle de qualité du produit. </w:t>
       </w:r>
       <w:hyperlink r:id="rId18" w:history="1">
         <w:r>
@@ -5347,7 +5387,25 @@
           <w:szCs w:val="18"/>
           <w:lang w:val="en-CA"/>
         </w:rPr>
-        <w:t xml:space="preserve"> 62859:2016 et son amendement A1:2019, Nuclear power plants — Instrumentation and control systems — Requirements for coordinating safety and cybersecurity. </w:t>
+        <w:t xml:space="preserve"> 62859:2016 et son </w:t>
+      </w:r>
+      <w:proofErr w:type="spellStart"/>
+      <w:r>
+        <w:rPr>
+          <w:sz w:val="18"/>
+          <w:szCs w:val="18"/>
+          <w:lang w:val="en-CA"/>
+        </w:rPr>
+        <w:t>amendement</w:t>
+      </w:r>
+      <w:proofErr w:type="spellEnd"/>
+      <w:r>
+        <w:rPr>
+          <w:sz w:val="18"/>
+          <w:szCs w:val="18"/>
+          <w:lang w:val="en-CA"/>
+        </w:rPr>
+        <w:t xml:space="preserve"> A1:2019, Nuclear power plants — Instrumentation and control systems — Requirements for coordinating safety and cybersecurity. </w:t>
       </w:r>
       <w:hyperlink r:id="rId26" w:history="1">
         <w:r>
@@ -5396,7 +5454,25 @@
           <w:szCs w:val="18"/>
           <w:lang w:val="en-CA"/>
         </w:rPr>
-        <w:t xml:space="preserve"> 61513:2026 (éd. 3.0), Nuclear power plants — Instrumentation and control important to safety — General requirements for systems. </w:t>
+        <w:t xml:space="preserve"> 61513:2026 (</w:t>
+      </w:r>
+      <w:proofErr w:type="spellStart"/>
+      <w:r>
+        <w:rPr>
+          <w:sz w:val="18"/>
+          <w:szCs w:val="18"/>
+          <w:lang w:val="en-CA"/>
+        </w:rPr>
+        <w:t>éd</w:t>
+      </w:r>
+      <w:proofErr w:type="spellEnd"/>
+      <w:r>
+        <w:rPr>
+          <w:sz w:val="18"/>
+          <w:szCs w:val="18"/>
+          <w:lang w:val="en-CA"/>
+        </w:rPr>
+        <w:t xml:space="preserve">. 3.0), Nuclear power plants — Instrumentation and control important to safety — General requirements for systems. </w:t>
       </w:r>
       <w:hyperlink r:id="rId27" w:history="1">
         <w:r>
@@ -5670,8 +5746,27 @@
                 <w:sz w:val="18"/>
                 <w:szCs w:val="18"/>
               </w:rPr>
-              <w:t>[1]</w:t>
-            </w:r>
+              <w:t>[1] à [7]</w:t>
+            </w:r>
+          </w:p>
+        </w:tc>
+        <w:tc>
+          <w:tcPr>
+            <w:tcW w:w="8079" w:type="dxa"/>
+          </w:tcPr>
+          <w:p>
+            <w:r>
+              <w:t>Accès gratuit au texte complet ou au document officiel</w:t>
+            </w:r>
+          </w:p>
+        </w:tc>
+      </w:tr>
+      <w:tr>
+        <w:tc>
+          <w:tcPr>
+            <w:tcW w:w="1271" w:type="dxa"/>
+          </w:tcPr>
+          <w:p>
             <w:r>
               <w:rPr>
                 <w:b/>
@@ -5679,116 +5774,7 @@
                 <w:sz w:val="18"/>
                 <w:szCs w:val="18"/>
               </w:rPr>
-              <w:t xml:space="preserve"> à </w:t>
-            </w:r>
-            <w:r>
-              <w:rPr>
-                <w:b/>
-                <w:bCs/>
-                <w:sz w:val="18"/>
-                <w:szCs w:val="18"/>
-              </w:rPr>
-              <w:t>[</w:t>
-            </w:r>
-            <w:r>
-              <w:rPr>
-                <w:b/>
-                <w:bCs/>
-                <w:sz w:val="18"/>
-                <w:szCs w:val="18"/>
-              </w:rPr>
-              <w:t>7</w:t>
-            </w:r>
-            <w:r>
-              <w:rPr>
-                <w:b/>
-                <w:bCs/>
-                <w:sz w:val="18"/>
-                <w:szCs w:val="18"/>
-              </w:rPr>
-              <w:t>]</w:t>
-            </w:r>
-          </w:p>
-        </w:tc>
-        <w:tc>
-          <w:tcPr>
-            <w:tcW w:w="8079" w:type="dxa"/>
-          </w:tcPr>
-          <w:p>
-            <w:r>
-              <w:t>Accès gratuit au texte complet ou au document officiel</w:t>
-            </w:r>
-          </w:p>
-        </w:tc>
-      </w:tr>
-      <w:tr>
-        <w:tc>
-          <w:tcPr>
-            <w:tcW w:w="1271" w:type="dxa"/>
-          </w:tcPr>
-          <w:p>
-            <w:r>
-              <w:rPr>
-                <w:b/>
-                <w:bCs/>
-                <w:sz w:val="18"/>
-                <w:szCs w:val="18"/>
-              </w:rPr>
-              <w:t>[</w:t>
-            </w:r>
-            <w:r>
-              <w:rPr>
-                <w:b/>
-                <w:bCs/>
-                <w:sz w:val="18"/>
-                <w:szCs w:val="18"/>
-              </w:rPr>
-              <w:t>8</w:t>
-            </w:r>
-            <w:r>
-              <w:rPr>
-                <w:b/>
-                <w:bCs/>
-                <w:sz w:val="18"/>
-                <w:szCs w:val="18"/>
-              </w:rPr>
-              <w:t>]</w:t>
-            </w:r>
-            <w:r>
-              <w:rPr>
-                <w:b/>
-                <w:bCs/>
-                <w:sz w:val="18"/>
-                <w:szCs w:val="18"/>
-              </w:rPr>
-              <w:t xml:space="preserve"> à </w:t>
-            </w:r>
-            <w:r>
-              <w:rPr>
-                <w:b/>
-                <w:bCs/>
-                <w:sz w:val="18"/>
-                <w:szCs w:val="18"/>
-              </w:rPr>
-              <w:t>[</w:t>
-            </w:r>
-            <w:r>
-              <w:rPr>
-                <w:b/>
-                <w:bCs/>
-                <w:sz w:val="18"/>
-                <w:szCs w:val="18"/>
-              </w:rPr>
-              <w:t>24</w:t>
-            </w:r>
-            <w:r>
-              <w:rPr>
-                <w:b/>
-                <w:bCs/>
-                <w:sz w:val="18"/>
-                <w:szCs w:val="18"/>
-              </w:rPr>
-              <w:t>]</w:t>
+              <w:t>[8] à [24]</w:t>
             </w:r>
           </w:p>
         </w:tc>
@@ -6592,7 +6578,7 @@
     <w:name w:val="List Paragraph"/>
     <w:qFormat/>
   </w:style>
-  <w:style w:type="character" w:styleId="Lienhypertexte">
+  <w:style w:type="character" w:styleId="Hyperlien">
     <w:name w:val="Hyperlink"/>
     <w:uiPriority w:val="99"/>
     <w:unhideWhenUsed/>

</xml_diff>